<commit_message>
feat: implement bulk archiving functionality for Surat Masuk and Surat Keluar; add selection handling in UI components and update controllers for improved user experience
</commit_message>
<xml_diff>
--- a/docs/pengujian-alpha.docx
+++ b/docs/pengujian-alpha.docx
@@ -4527,7 +4527,7 @@
                 <w:color w:val="000000"/>
                 <w:sz w:val="22"/>
               </w:rPr>
-              <w:t>Sistem memperbarui status menjadi terverifikasi dan menampilkan pesan 'Surat berhasil direview dan tingkat ditetapkan'</w:t>
+              <w:t>Sistem memperbarui status menjadi terverifikasi dan menampilkan pesan 'Surat berhasil direview dan tindak lanjut ditetapkan'</w:t>
             </w:r>
           </w:p>
         </w:tc>
@@ -6609,7 +6609,7 @@
                 <w:color w:val="000000"/>
                 <w:sz w:val="22"/>
               </w:rPr>
-              <w:t>Sistem menampilkan halaman arsip surat masuk dan surat keluar</w:t>
+              <w:t>Sistem menampilkan halaman arsip yang berisi surat masuk dan surat keluar yang sudah diarsipkan</w:t>
             </w:r>
           </w:p>
         </w:tc>
@@ -6675,7 +6675,7 @@
                 <w:color w:val="000000"/>
                 <w:sz w:val="22"/>
               </w:rPr>
-              <w:t>Pengguna mencari arsip dengan prefix nomor surat yang ada di database</w:t>
+              <w:t>Pengguna mencari nomor agenda yang ada di database, misalnya SM/2026, SM/2026/08, atau SM/2026/08/0005</w:t>
             </w:r>
           </w:p>
         </w:tc>
@@ -6703,7 +6703,7 @@
                 <w:color w:val="000000"/>
                 <w:sz w:val="22"/>
               </w:rPr>
-              <w:t>Sistem menampilkan daftar arsip yang nomor suratnya cocok dengan prefix pencarian</w:t>
+              <w:t>Sistem menampilkan arsip yang nomor agendanya cocok. Kode SM menampilkan surat masuk dan kode SK menampilkan surat keluar</w:t>
             </w:r>
           </w:p>
         </w:tc>
@@ -6769,7 +6769,7 @@
                 <w:color w:val="000000"/>
                 <w:sz w:val="22"/>
               </w:rPr>
-              <w:t>Pengguna mencari arsip dengan nomor surat yang tidak ditemukan</w:t>
+              <w:t>Pengguna mencari nomor surat yang ada di database melalui filter Nomor Surat</w:t>
             </w:r>
           </w:p>
         </w:tc>
@@ -6797,7 +6797,7 @@
                 <w:color w:val="000000"/>
                 <w:sz w:val="22"/>
               </w:rPr>
-              <w:t>Sistem menampilkan daftar kosong / pesan bahwa data tidak ditemukan</w:t>
+              <w:t>Sistem menampilkan arsip yang nomor suratnya mengandung kata kunci pencarian</w:t>
             </w:r>
           </w:p>
         </w:tc>
@@ -6863,7 +6863,7 @@
                 <w:color w:val="000000"/>
                 <w:sz w:val="22"/>
               </w:rPr>
-              <w:t>Pengguna memfilter arsip berdasarkan jenis surat (masuk / keluar)</w:t>
+              <w:t>Pengguna mencari nomor surat atau nomor agenda yang tidak ditemukan</w:t>
             </w:r>
           </w:p>
         </w:tc>
@@ -6891,7 +6891,101 @@
                 <w:color w:val="000000"/>
                 <w:sz w:val="22"/>
               </w:rPr>
-              <w:t>Sistem menampilkan hanya arsip sesuai filter jenis yang dipilih</w:t>
+              <w:t>Sistem menampilkan pesan 'Belum ada surat di arsip' dan 'Coba ubah kata kunci pencarian atau filter.'</w:t>
+            </w:r>
+          </w:p>
+        </w:tc>
+        <w:tc>
+          <w:tcPr>
+            <w:tcW w:type="dxa" w:w="1134"/>
+            <w:tcBorders>
+              <w:top w:val="single" w:sz="4" w:color="000000" w:space="0"/>
+              <w:left w:val="single" w:sz="4" w:color="000000" w:space="0"/>
+              <w:bottom w:val="single" w:sz="4" w:color="000000" w:space="0"/>
+              <w:right w:val="single" w:sz="4" w:color="000000" w:space="0"/>
+            </w:tcBorders>
+          </w:tcPr>
+          <w:p>
+            <w:pPr>
+              <w:spacing w:before="40" w:after="40"/>
+              <w:jc w:val="center"/>
+            </w:pPr>
+            <w:r/>
+          </w:p>
+        </w:tc>
+        <w:tc>
+          <w:tcPr>
+            <w:tcW w:type="dxa" w:w="1417"/>
+            <w:tcBorders>
+              <w:top w:val="single" w:sz="4" w:color="000000" w:space="0"/>
+              <w:left w:val="single" w:sz="4" w:color="000000" w:space="0"/>
+              <w:bottom w:val="single" w:sz="4" w:color="000000" w:space="0"/>
+              <w:right w:val="single" w:sz="4" w:color="000000" w:space="0"/>
+            </w:tcBorders>
+          </w:tcPr>
+          <w:p>
+            <w:pPr>
+              <w:spacing w:before="40" w:after="40"/>
+              <w:jc w:val="center"/>
+            </w:pPr>
+            <w:r/>
+          </w:p>
+        </w:tc>
+      </w:tr>
+      <w:tr>
+        <w:tc>
+          <w:tcPr>
+            <w:tcW w:type="dxa" w:w="3685"/>
+            <w:tcBorders>
+              <w:top w:val="single" w:sz="4" w:color="000000" w:space="0"/>
+              <w:left w:val="single" w:sz="4" w:color="000000" w:space="0"/>
+              <w:bottom w:val="single" w:sz="4" w:color="000000" w:space="0"/>
+              <w:right w:val="single" w:sz="4" w:color="000000" w:space="0"/>
+            </w:tcBorders>
+          </w:tcPr>
+          <w:p>
+            <w:pPr>
+              <w:spacing w:before="40" w:after="40"/>
+              <w:jc w:val="left"/>
+            </w:pPr>
+            <w:r/>
+            <w:r>
+              <w:rPr>
+                <w:rFonts w:ascii="Times New Roman" w:hAnsi="Times New Roman" w:eastAsia="Times New Roman"/>
+                <w:b w:val="0"/>
+                <w:i w:val="0"/>
+                <w:color w:val="000000"/>
+                <w:sz w:val="22"/>
+              </w:rPr>
+              <w:t>Pengguna memfilter arsip berdasarkan jenis surat masuk atau surat keluar</w:t>
+            </w:r>
+          </w:p>
+        </w:tc>
+        <w:tc>
+          <w:tcPr>
+            <w:tcW w:type="dxa" w:w="3969"/>
+            <w:tcBorders>
+              <w:top w:val="single" w:sz="4" w:color="000000" w:space="0"/>
+              <w:left w:val="single" w:sz="4" w:color="000000" w:space="0"/>
+              <w:bottom w:val="single" w:sz="4" w:color="000000" w:space="0"/>
+              <w:right w:val="single" w:sz="4" w:color="000000" w:space="0"/>
+            </w:tcBorders>
+          </w:tcPr>
+          <w:p>
+            <w:pPr>
+              <w:spacing w:before="40" w:after="40"/>
+              <w:jc w:val="left"/>
+            </w:pPr>
+            <w:r/>
+            <w:r>
+              <w:rPr>
+                <w:rFonts w:ascii="Times New Roman" w:hAnsi="Times New Roman" w:eastAsia="Times New Roman"/>
+                <w:b w:val="0"/>
+                <w:i w:val="0"/>
+                <w:color w:val="000000"/>
+                <w:sz w:val="22"/>
+              </w:rPr>
+              <w:t>Sistem menampilkan hanya arsip sesuai jenis yang dipilih</w:t>
             </w:r>
           </w:p>
         </w:tc>
@@ -6985,7 +7079,7 @@
                 <w:color w:val="000000"/>
                 <w:sz w:val="22"/>
               </w:rPr>
-              <w:t>Sistem menampilkan detail lengkap arsip surat yang dipilih</w:t>
+              <w:t>Sistem menampilkan detail arsip yang dipilih, meliputi perihal, nomor surat, jenis surat, status diarsipkan, nomor agenda, tanggal surat, serta pengirim atau tujuan</w:t>
             </w:r>
           </w:p>
         </w:tc>

</xml_diff>